<commit_message>
Añadidas cuestiones sobre plásticos
</commit_message>
<xml_diff>
--- a/build/es_material_plastics.docx
+++ b/build/es_material_plastics.docx
@@ -25,7 +25,7 @@
       <w:r>
         <w:t>a)</w:t>
         <w:tab/>
-        <w:t>Parecida a la densidad del agua</w:t>
+        <w:t>Mucho mayor que la densidad del agua</w:t>
       </w:r>
     </w:p>
     <w:p>
@@ -35,7 +35,7 @@
       <w:r>
         <w:t>b)</w:t>
         <w:tab/>
-        <w:t>Mucho menor que la densidad del agua</w:t>
+        <w:t>Parecida a la densidad del agua</w:t>
       </w:r>
     </w:p>
     <w:p>
@@ -45,7 +45,7 @@
       <w:r>
         <w:t>c)</w:t>
         <w:tab/>
-        <w:t>Los plásticos no tienen densidad</w:t>
+        <w:t>Mucho menor que la densidad del agua</w:t>
       </w:r>
     </w:p>
     <w:p>
@@ -55,7 +55,7 @@
       <w:r>
         <w:t>d)</w:t>
         <w:tab/>
-        <w:t>Mucho mayor que la densidad del agua</w:t>
+        <w:t>Los plásticos no tienen densidad</w:t>
       </w:r>
     </w:p>
     <w:p>
@@ -131,7 +131,7 @@
       <w:r>
         <w:t>b)</w:t>
         <w:tab/>
-        <w:t>Conducen bien el calor y la electricidad</w:t>
+        <w:t>Conducen bien la electricidad pero mal el calor</w:t>
       </w:r>
     </w:p>
     <w:p>
@@ -151,7 +151,7 @@
       <w:r>
         <w:t>d)</w:t>
         <w:tab/>
-        <w:t>Conducen bien la electricidad pero mal el calor</w:t>
+        <w:t>Conducen bien el calor y la electricidad</w:t>
       </w:r>
     </w:p>
     <w:p>
@@ -169,7 +169,7 @@
       <w:r>
         <w:t>a)</w:t>
         <w:tab/>
-        <w:t>No son renovables</w:t>
+        <w:t>Si son renovables</w:t>
       </w:r>
     </w:p>
     <w:p>
@@ -189,7 +189,7 @@
       <w:r>
         <w:t>c)</w:t>
         <w:tab/>
-        <w:t>Si son renovables</w:t>
+        <w:t>No son renovables</w:t>
       </w:r>
     </w:p>
     <w:p>
@@ -207,7 +207,7 @@
       <w:r>
         <w:t>a)</w:t>
         <w:tab/>
-        <w:t>Si, porque tienen buena resistencia mecánica</w:t>
+        <w:t>La mayoría si, porque soportan bien los golpes sin romperse</w:t>
       </w:r>
     </w:p>
     <w:p>
@@ -217,7 +217,7 @@
       <w:r>
         <w:t>b)</w:t>
         <w:tab/>
-        <w:t>La mayoría si, porque soportan bien los golpes sin romperse</w:t>
+        <w:t>Si, porque tienen buena resistencia mecánica</w:t>
       </w:r>
     </w:p>
     <w:p>
@@ -227,7 +227,7 @@
       <w:r>
         <w:t>c)</w:t>
         <w:tab/>
-        <w:t>La mayoría si, porque soportan bien que les intentes rayar</w:t>
+        <w:t>No, son blandos</w:t>
       </w:r>
     </w:p>
     <w:p>
@@ -237,7 +237,7 @@
       <w:r>
         <w:t>d)</w:t>
         <w:tab/>
-        <w:t>No, son blandos</w:t>
+        <w:t>La mayoría si, porque soportan bien que les intentes rayar</w:t>
       </w:r>
     </w:p>
     <w:p>
@@ -255,7 +255,7 @@
       <w:r>
         <w:t>a)</w:t>
         <w:tab/>
-        <w:t>Muy dúctiles, pero poco maleables</w:t>
+        <w:t>Muy ductiles y muy maleables, por lo que es fácil fabricar hilos y láminas con ellos</w:t>
       </w:r>
     </w:p>
     <w:p>
@@ -275,7 +275,7 @@
       <w:r>
         <w:t>c)</w:t>
         <w:tab/>
-        <w:t>Muy ductiles y muy maleables, por lo que es fácil fabricar hilos y láminas con ellos</w:t>
+        <w:t>Muy maleables, pero poco dúctiles</w:t>
       </w:r>
     </w:p>
     <w:p>
@@ -285,7 +285,7 @@
       <w:r>
         <w:t>d)</w:t>
         <w:tab/>
-        <w:t>Muy maleables, pero poco dúctiles</w:t>
+        <w:t>Muy dúctiles, pero poco maleables</w:t>
       </w:r>
     </w:p>
     <w:p>
@@ -303,7 +303,7 @@
       <w:r>
         <w:t>a)</w:t>
         <w:tab/>
-        <w:t>Alto, porque que se funden por encima de 700ºC</w:t>
+        <w:t>Bajo, porque se funden a temperaturas mayores de 70ºC</w:t>
       </w:r>
     </w:p>
     <w:p>
@@ -313,7 +313,7 @@
       <w:r>
         <w:t>b)</w:t>
         <w:tab/>
-        <w:t>Bajo, porque se funden a temperaturas mayores de 70ºC</w:t>
+        <w:t>Bajo, por lo que no se pueden utilizar para resistir altas temperaturas</w:t>
       </w:r>
     </w:p>
     <w:p>
@@ -323,7 +323,7 @@
       <w:r>
         <w:t>c)</w:t>
         <w:tab/>
-        <w:t>Bajo, por lo que no se pueden utilizar para resistir altas temperaturas</w:t>
+        <w:t>Alto, porque que se funden por encima de 700ºC</w:t>
       </w:r>
     </w:p>
     <w:p>
@@ -351,7 +351,7 @@
       <w:r>
         <w:t>a)</w:t>
         <w:tab/>
-        <w:t>Es mala, se descomponen con facilidad</w:t>
+        <w:t>Tienen buena resistencia a los ácidos, pero mala a la oxidación</w:t>
       </w:r>
     </w:p>
     <w:p>
@@ -361,7 +361,7 @@
       <w:r>
         <w:t>b)</w:t>
         <w:tab/>
-        <w:t>Tienen buena resistencia a los ácidos, pero mala a la oxidación</w:t>
+        <w:t>Es mala, se descomponen con facilidad</w:t>
       </w:r>
     </w:p>
     <w:p>
@@ -371,7 +371,7 @@
       <w:r>
         <w:t>c)</w:t>
         <w:tab/>
-        <w:t>Es muy buena. Soportan sin problemas la oxidación y los ácidos</w:t>
+        <w:t>Tienen buena resistencia a la oxidación, pero mala resistencia a los ácidos</w:t>
       </w:r>
     </w:p>
     <w:p>
@@ -381,7 +381,179 @@
       <w:r>
         <w:t>d)</w:t>
         <w:tab/>
-        <w:t>Tienen buena resistencia a la oxidación, pero mala resistencia a los ácidos</w:t>
+        <w:t>Es muy buena. Soportan sin problemas la oxidación y los ácidos</w:t>
+      </w:r>
+    </w:p>
+    <w:p>
+      <w:pPr>
+        <w:pStyle w:val="ListNumber"/>
+      </w:pPr>
+      <w:r>
+        <w:t>¿Existen plásticos naturales o son todos sintéticos?</w:t>
+      </w:r>
+    </w:p>
+    <w:p>
+      <w:pPr>
+        <w:pStyle w:val="Choice"/>
+      </w:pPr>
+      <w:r>
+        <w:t>a)</w:t>
+        <w:tab/>
+        <w:t>No, son todos sintéticos</w:t>
+      </w:r>
+    </w:p>
+    <w:p>
+      <w:pPr>
+        <w:pStyle w:val="Choice"/>
+      </w:pPr>
+      <w:r>
+        <w:t>b)</w:t>
+        <w:tab/>
+        <w:t>Si hay plásticos naturales, por ejemplo el látex</w:t>
+      </w:r>
+    </w:p>
+    <w:p>
+      <w:pPr>
+        <w:pStyle w:val="ListNumber"/>
+      </w:pPr>
+      <w:r>
+        <w:t>¿Qué son los plásticos termoplásticos?</w:t>
+      </w:r>
+    </w:p>
+    <w:p>
+      <w:pPr>
+        <w:pStyle w:val="Choice"/>
+      </w:pPr>
+      <w:r>
+        <w:t>a)</w:t>
+        <w:tab/>
+        <w:t>Plásticos que se funden con el calor todas las veces que se desee</w:t>
+      </w:r>
+    </w:p>
+    <w:p>
+      <w:pPr>
+        <w:pStyle w:val="Choice"/>
+      </w:pPr>
+      <w:r>
+        <w:t>b)</w:t>
+        <w:tab/>
+        <w:t>Plásticos que no se funden con el calor</w:t>
+      </w:r>
+    </w:p>
+    <w:p>
+      <w:pPr>
+        <w:pStyle w:val="Choice"/>
+      </w:pPr>
+      <w:r>
+        <w:t>c)</w:t>
+        <w:tab/>
+        <w:t>Plásticos que se vuelven elásticos con el calor</w:t>
+      </w:r>
+    </w:p>
+    <w:p>
+      <w:pPr>
+        <w:pStyle w:val="Choice"/>
+      </w:pPr>
+      <w:r>
+        <w:t>d)</w:t>
+        <w:tab/>
+        <w:t>Plásticos elásticos, como el caucho</w:t>
+      </w:r>
+    </w:p>
+    <w:p>
+      <w:pPr>
+        <w:pStyle w:val="ListNumber"/>
+      </w:pPr>
+      <w:r>
+        <w:t>¿Qué son los plásticos termoestables?</w:t>
+      </w:r>
+    </w:p>
+    <w:p>
+      <w:pPr>
+        <w:pStyle w:val="Choice"/>
+      </w:pPr>
+      <w:r>
+        <w:t>a)</w:t>
+        <w:tab/>
+        <w:t>Plásticos que se vuelven elásticos con el calor</w:t>
+      </w:r>
+    </w:p>
+    <w:p>
+      <w:pPr>
+        <w:pStyle w:val="Choice"/>
+      </w:pPr>
+      <w:r>
+        <w:t>b)</w:t>
+        <w:tab/>
+        <w:t>Plásticos elásticos, como el caucho</w:t>
+      </w:r>
+    </w:p>
+    <w:p>
+      <w:pPr>
+        <w:pStyle w:val="Choice"/>
+      </w:pPr>
+      <w:r>
+        <w:t>c)</w:t>
+        <w:tab/>
+        <w:t>Plásticos que no se funden con el calor</w:t>
+      </w:r>
+    </w:p>
+    <w:p>
+      <w:pPr>
+        <w:pStyle w:val="Choice"/>
+      </w:pPr>
+      <w:r>
+        <w:t>d)</w:t>
+        <w:tab/>
+        <w:t>Plásticos que se funden con el calor todas las veces que se desee</w:t>
+      </w:r>
+    </w:p>
+    <w:p>
+      <w:pPr>
+        <w:pStyle w:val="ListNumber"/>
+      </w:pPr>
+      <w:r>
+        <w:t>¿Qué son los plásticos elastómeros?</w:t>
+      </w:r>
+    </w:p>
+    <w:p>
+      <w:pPr>
+        <w:pStyle w:val="Choice"/>
+      </w:pPr>
+      <w:r>
+        <w:t>a)</w:t>
+        <w:tab/>
+        <w:t>Plásticos que se vuelven elásticos con el calor</w:t>
+      </w:r>
+    </w:p>
+    <w:p>
+      <w:pPr>
+        <w:pStyle w:val="Choice"/>
+      </w:pPr>
+      <w:r>
+        <w:t>b)</w:t>
+        <w:tab/>
+        <w:t>Plásticos elásticos, como el caucho</w:t>
+      </w:r>
+    </w:p>
+    <w:p>
+      <w:pPr>
+        <w:pStyle w:val="Choice"/>
+      </w:pPr>
+      <w:r>
+        <w:t>c)</w:t>
+        <w:tab/>
+        <w:t>Plásticos que se funden con el calor todas las veces que se desee</w:t>
+      </w:r>
+    </w:p>
+    <w:p>
+      <w:pPr>
+        <w:pStyle w:val="Choice"/>
+      </w:pPr>
+      <w:r>
+        <w:t>d)</w:t>
+        <w:tab/>
+        <w:t>Plásticos que no se funden con el calor</w:t>
       </w:r>
     </w:p>
     <w:sectPr>

</xml_diff>